<commit_message>
Define D2/D3/D4, GBFS, PRISMA-ScR, and CI at first use in the abstract
Co-Authored-By: Tatsuki Onishi <bougtoir@gmail.com>
</commit_message>
<xml_diff>
--- a/discharged_secrets_ijcip/output/Manuscript_CompSec.docx
+++ b/discharged_secrets_ijcip/output/Manuscript_CompSec.docx
@@ -73,7 +73,7 @@
         <w:t xml:space="preserve">Methods: </w:t>
       </w:r>
       <w:r>
-        <w:t>We combined a PRISMA-ScR scoping review of 2,169 records, a cross-sectional field audit of public GBFS feeds, and a structured disclosure audit of public operator privacy notices across 14 domains, using deterministic screening and explicit denominators with 95% Wilson confidence intervals.</w:t>
+        <w:t>We combined a scoping review reported using the Preferred Reporting Items for Systematic Reviews and Meta-Analyses extension for Scoping Reviews (PRISMA-ScR) of 2,169 records, a cross-sectional field audit of public General Bikeshare Feed Specification (GBFS) feeds, and a structured disclosure audit of public operator privacy notices across 14 domains, using deterministic screening and explicit denominators with 95% Wilson confidence intervals (CIs).</w:t>
       </w:r>
     </w:p>
     <w:p>
@@ -87,7 +87,7 @@
         <w:t xml:space="preserve">Results: </w:t>
       </w:r>
       <w:r>
-        <w:t>Eighteen direct studies were included (5 D4, 9 D3, 4 D2), with the strongest evidence at the operation stage. Across 813 motorized micromobility feeds, vehicle identifiers appeared in 100% and coordinates in 99.4%, while battery percentage appeared in 68.9%. Operator notices documented operational processing thoroughly but were silent on device disposal and vulnerability reporting.</w:t>
+        <w:t>Eighteen direct studies were included (5 direct-empirical, D4; 9 direct-documentary, D3; 4 near-domain, D2), with the strongest evidence at the operation stage. Across 813 motorized micromobility feeds, vehicle identifiers appeared in 100% and coordinates in 99.4%, while battery percentage appeared in 68.9%. Operator notices documented operational processing thoroughly but were silent on device disposal and vulnerability reporting.</w:t>
       </w:r>
     </w:p>
     <w:p>
@@ -683,7 +683,7 @@
           <w:rFonts w:ascii="Times New Roman" w:hAnsi="Times New Roman"/>
           <w:sz w:val="24"/>
         </w:rPr>
-        <w:t>We froze a snapshot of the public GBFS systems catalogue [14] and recorded its checksum. For each system we attempted to reach the auto-discovery endpoint, to locate a declared vehicle-status feed, to retrieve that feed, and to record which specification fields it contained. The unit of analysis is the system/feed. To respect the study's safety constraints, we recorded only the presence or absence of each field; raw vehicle identifiers, exact coordinates, and vehicle-specific deep links were not retained. Unavailable or empty feeds were separated from feeds that were retrieved but omitted a field, and all proportions are reported against explicit denominators with 95% Wilson confidence intervals. Because several large operators run many city systems, we also computed an operator-domain sensitivity analysis to check whether prevalence was driven by a few operators.</w:t>
+        <w:t>We froze a snapshot of the public GBFS systems catalogue [14] and recorded its checksum. For each system we attempted to reach the auto-discovery endpoint, to locate a declared vehicle-status feed, to retrieve that feed, and to record which specification fields it contained. The unit of analysis is the system/feed. To respect the study's safety constraints, we recorded only the presence or absence of each field; raw vehicle identifiers, exact coordinates, and vehicle-specific deep links were not retained. Unavailable or empty feeds were separated from feeds that were retrieved but omitted a field, and all proportions are reported against explicit denominators with 95% Wilson confidence intervals (CIs). Because several large operators run many city systems, we also computed an operator-domain sensitivity analysis to check whether prevalence was driven by a few operators.</w:t>
       </w:r>
     </w:p>
     <w:p>

</xml_diff>

<commit_message>
Introduce evidence-distance codes only in Methods; relate to GRADE indirectness
Co-Authored-By: Tatsuki Onishi <bougtoir@gmail.com>
</commit_message>
<xml_diff>
--- a/discharged_secrets_ijcip/output/Manuscript_CompSec.docx
+++ b/discharged_secrets_ijcip/output/Manuscript_CompSec.docx
@@ -87,7 +87,7 @@
         <w:t xml:space="preserve">Results: </w:t>
       </w:r>
       <w:r>
-        <w:t>Eighteen direct studies were included (5 direct-empirical, D4; 9 direct-documentary, D3; 4 near-domain, D2), with the strongest evidence at the operation stage. Across 813 motorized micromobility feeds, vehicle identifiers appeared in 100% and coordinates in 99.4%, while battery percentage appeared in 68.9%. Operator notices documented operational processing thoroughly but were silent on device disposal and vulnerability reporting.</w:t>
+        <w:t>Eighteen direct studies were included (5 direct-empirical, 9 direct-documentary, and 4 near-domain), with the strongest evidence at the operation stage. Across 813 motorized micromobility feeds, vehicle identifiers appeared in 100% and coordinates in 99.4%, while battery percentage appeared in 68.9%. Operator notices documented operational processing thoroughly but were silent on device disposal and vulnerability reporting.</w:t>
       </w:r>
     </w:p>
     <w:p>
@@ -662,7 +662,7 @@
           <w:rFonts w:ascii="Times New Roman" w:hAnsi="Times New Roman"/>
           <w:sz w:val="24"/>
         </w:rPr>
-        <w:t>Records marked include or uncertain were sought for full-text assessment. Each retrieved study was classified by evidence distance: D4, direct target-domain empirical evidence; D3, direct target-domain documentary evidence; D2, near-domain empirical evidence; D1, mechanism analogy; and N, normative evidence. We did not treat a title/abstract decision as equivalent to a confirmed full-text finding, and we did not claim to have read full text that could not be retrieved. From the included studies we built a study-level extraction table capturing device or service, design, data fields, access path, reported outcome, and limitations.</w:t>
+        <w:t>Records marked include or uncertain were sought for full-text assessment. Each retrieved study was classified by evidence distance: D4, direct target-domain empirical evidence; D3, direct target-domain documentary evidence; D2, near-domain empirical evidence; D1, mechanism analogy; and N, normative evidence. This ordering is an operational classification defined for the present study; it is conceptually related to the GRADE notion of indirectness [17] but is not a GRADE certainty rating. We did not treat a title/abstract decision as equivalent to a confirmed full-text finding, and we did not claim to have read full text that could not be retrieved. From the included studies we built a study-level extraction table capturing device or service, design, data fields, access path, reported outcome, and limitations.</w:t>
       </w:r>
     </w:p>
     <w:p>
@@ -704,7 +704,7 @@
           <w:rFonts w:ascii="Times New Roman" w:hAnsi="Times New Roman"/>
           <w:sz w:val="24"/>
         </w:rPr>
-        <w:t>We selected operators from the audited GBFS population and retrieved their public privacy notices. For each operator document we coded 14 disclosure domains - location; trip and time data; vehicle identifiers; battery or diagnostic data; maintenance or repair records; account, payment, and device data; analytics or profiling; retention; processors or contractors; international transfers; data-subject rights; incident contact; vulnerability disclosure; and device return, recycling, or disposal - using the values explicit, partial, not found, not applicable, and unavailable. A not-found coding means the document did not address the domain; it is not evidence that the practice does not occur. Each coding is accompanied by a short verbatim locator quotation in the coding sheet so that a third party can check it. Coding was computer-assisted and reviewed by a single reviewer; governance and standards documents [15-19] were used as reference points and were not coded as operator practices.</w:t>
+        <w:t>We selected operators from the audited GBFS population and retrieved their public privacy notices. For each operator document we coded 14 disclosure domains - location; trip and time data; vehicle identifiers; battery or diagnostic data; maintenance or repair records; account, payment, and device data; analytics or profiling; retention; processors or contractors; international transfers; data-subject rights; incident contact; vulnerability disclosure; and device return, recycling, or disposal - using the values explicit, partial, not found, not applicable, and unavailable. A not-found coding means the document did not address the domain; it is not evidence that the practice does not occur. Each coding is accompanied by a short verbatim locator quotation in the coding sheet so that a third party can check it. Coding was computer-assisted and reviewed by a single reviewer; governance and standards documents [15,16,18-20] were used as reference points and were not coded as operator practices.</w:t>
       </w:r>
     </w:p>
     <w:p>
@@ -746,7 +746,7 @@
           <w:rFonts w:ascii="Times New Roman" w:hAnsi="Times New Roman"/>
           <w:sz w:val="24"/>
         </w:rPr>
-        <w:t>The included D4 studies provide the strongest evidence. A long-term real-world analysis reconstructed rider-relevant patterns from operator data [2]; investigative studies of rental applications and scooter ecosystems demonstrated collection and protocol weaknesses [3,4,20]; and a forensic analysis recovered data from micromobility devices [6]. D3 studies document platform architectures, location-spoofing threats, data-acquisition frameworks, and user-facing traceability concerns [5,21-28]. D2 studies transfer from adjacent domains: battery side channels and battery-management data [9,10], residual data in reused IoT devices [7], and cloud data remanence [8]. No included study, on its own, demonstrated an end-to-end lifecycle compromise; the evidence is strongest for operation and weakest for recall and disposal.</w:t>
+        <w:t>The included D4 studies provide the strongest evidence. A long-term real-world analysis reconstructed rider-relevant patterns from operator data [2]; investigative studies of rental applications and scooter ecosystems demonstrated collection and protocol weaknesses [3,4,21]; and a forensic analysis recovered data from micromobility devices [6]. D3 studies document platform architectures, location-spoofing threats, data-acquisition frameworks, and user-facing traceability concerns [5,22-29]. D2 studies transfer from adjacent domains: battery side channels and battery-management data [9,10], residual data in reused IoT devices [7], and cloud data remanence [8]. No included study, on its own, demonstrated an end-to-end lifecycle compromise; the evidence is strongest for operation and weakest for recall and disposal.</w:t>
       </w:r>
     </w:p>
     <w:p>
@@ -1092,7 +1092,7 @@
                 <w:rFonts w:ascii="Arial" w:hAnsi="Arial"/>
                 <w:sz w:val="16"/>
               </w:rPr>
-              <w:t>Casagrande et al [20]</w:t>
+              <w:t>Casagrande et al [21]</w:t>
             </w:r>
           </w:p>
         </w:tc>
@@ -1484,7 +1484,7 @@
                 <w:rFonts w:ascii="Arial" w:hAnsi="Arial"/>
                 <w:sz w:val="16"/>
               </w:rPr>
-              <w:t>Hannemann et al [28]</w:t>
+              <w:t>Hannemann et al [29]</w:t>
             </w:r>
           </w:p>
         </w:tc>
@@ -1582,7 +1582,7 @@
                 <w:rFonts w:ascii="Arial" w:hAnsi="Arial"/>
                 <w:sz w:val="16"/>
               </w:rPr>
-              <w:t>Isik et al [21]</w:t>
+              <w:t>Isik et al [22]</w:t>
             </w:r>
           </w:p>
         </w:tc>
@@ -1680,7 +1680,7 @@
                 <w:rFonts w:ascii="Arial" w:hAnsi="Arial"/>
                 <w:sz w:val="16"/>
               </w:rPr>
-              <w:t>Li et al [25]</w:t>
+              <w:t>Li et al [26]</w:t>
             </w:r>
           </w:p>
         </w:tc>
@@ -1778,7 +1778,7 @@
                 <w:rFonts w:ascii="Arial" w:hAnsi="Arial"/>
                 <w:sz w:val="16"/>
               </w:rPr>
-              <w:t>Petersen (2019) [26]</w:t>
+              <w:t>Petersen (2019) [27]</w:t>
             </w:r>
           </w:p>
         </w:tc>
@@ -1876,7 +1876,7 @@
                 <w:rFonts w:ascii="Arial" w:hAnsi="Arial"/>
                 <w:sz w:val="16"/>
               </w:rPr>
-              <w:t>Sato et al [24]</w:t>
+              <w:t>Sato et al [25]</w:t>
             </w:r>
           </w:p>
         </w:tc>
@@ -1974,7 +1974,7 @@
                 <w:rFonts w:ascii="Arial" w:hAnsi="Arial"/>
                 <w:sz w:val="16"/>
               </w:rPr>
-              <w:t>Vinayaga-Sureshkanth et al [22]</w:t>
+              <w:t>Vinayaga-Sureshkanth et al [23]</w:t>
             </w:r>
           </w:p>
         </w:tc>
@@ -2072,7 +2072,7 @@
                 <w:rFonts w:ascii="Arial" w:hAnsi="Arial"/>
                 <w:sz w:val="16"/>
               </w:rPr>
-              <w:t>Yilmaz et al [23]</w:t>
+              <w:t>Yilmaz et al [24]</w:t>
             </w:r>
           </w:p>
         </w:tc>
@@ -2268,7 +2268,7 @@
                 <w:rFonts w:ascii="Arial" w:hAnsi="Arial"/>
                 <w:sz w:val="16"/>
               </w:rPr>
-              <w:t>Zhou (2024) [27]</w:t>
+              <w:t>Zhou (2024) [28]</w:t>
             </w:r>
           </w:p>
         </w:tc>
@@ -3842,7 +3842,7 @@
           <w:rFonts w:ascii="Times New Roman" w:hAnsi="Times New Roman"/>
           <w:sz w:val="24"/>
         </w:rPr>
-        <w:t>We coded 13 operator privacy notices across 14 domains; two further operators could not be retrieved as reproducible text and were recorded as unavailable (Fig. 4; Table 4). Operational and account-level processing was disclosed almost universally: location data were explicit for 11 of 13 operators, and retention, processors or contractors, and account/payment/device data were explicit for most. Data-subject rights and international transfers were explicit or partial for the large majority, consistent with a predominantly European operator sample governed by the General Data Protection Regulation [29].</w:t>
+        <w:t>We coded 13 operator privacy notices across 14 domains; two further operators could not be retrieved as reproducible text and were recorded as unavailable (Fig. 4; Table 4). Operational and account-level processing was disclosed almost universally: location data were explicit for 11 of 13 operators, and retention, processors or contractors, and account/payment/device data were explicit for most. Data-subject rights and international transfers were explicit or partial for the large majority, consistent with a predominantly European operator sample governed by the General Data Protection Regulation [30].</w:t>
       </w:r>
     </w:p>
     <w:p>
@@ -5434,7 +5434,7 @@
           <w:rFonts w:ascii="Times New Roman" w:hAnsi="Times New Roman"/>
           <w:sz w:val="24"/>
         </w:rPr>
-        <w:t>We integrate these observations in a six-stage lifecycle model that links each stage to the evidence distance of its supporting sources and to a proposed control (Fig. 5; Table 5). The model makes the strength of the underlying evidence explicit: procurement, deployment, operation, and maintenance are anchored by direct (D3-D4) evidence, whereas recall/return and second-life/disposal rest on near-domain (D2) analogy and on governance and standards guidance [17-19]. The controls - field minimization, local processing, access and retention limits, controlled contractor access, chain-of-custody for returned units, and verified media sanitization - are proposals whose effectiveness this study did not test; Table 5 records their effectiveness evidence conservatively.</w:t>
+        <w:t>We integrate these observations in a six-stage lifecycle model that links each stage to the evidence distance of its supporting sources and to a proposed control (Fig. 5; Table 5). The model makes the strength of the underlying evidence explicit: procurement, deployment, operation, and maintenance are anchored by direct (D3-D4) evidence, whereas recall/return and second-life/disposal rest on near-domain (D2) analogy and on governance and standards guidance [18-20]. The controls - field minimization, local processing, access and retention limits, controlled contractor access, chain-of-custody for returned units, and verified media sanitization - are proposals whose effectiveness this study did not test; Table 5 records their effectiveness evidence conservatively.</w:t>
       </w:r>
     </w:p>
     <w:p>
@@ -5714,7 +5714,7 @@
                 <w:rFonts w:ascii="Arial" w:hAnsi="Arial"/>
                 <w:sz w:val="16"/>
               </w:rPr>
-              <w:t>Governance guidance (N) [16,18]</w:t>
+              <w:t>Governance guidance (N) [16,19]</w:t>
             </w:r>
           </w:p>
         </w:tc>
@@ -6080,7 +6080,7 @@
                 <w:rFonts w:ascii="Arial" w:hAnsi="Arial"/>
                 <w:sz w:val="16"/>
               </w:rPr>
-              <w:t>Forensic and platform studies (D3-D4) [6,21]</w:t>
+              <w:t>Forensic and platform studies (D3-D4) [6,22]</w:t>
             </w:r>
           </w:p>
         </w:tc>
@@ -6324,7 +6324,7 @@
                 <w:rFonts w:ascii="Arial" w:hAnsi="Arial"/>
                 <w:sz w:val="16"/>
               </w:rPr>
-              <w:t>Data remanence and battery side-channel (D2) [8-10]; sanitization guidance (N) [17]</w:t>
+              <w:t>Data remanence and battery side-channel (D2) [8-10]; sanitization guidance (N) [18]</w:t>
             </w:r>
           </w:p>
         </w:tc>
@@ -6671,7 +6671,7 @@
         <w:ind w:left="403" w:hanging="403"/>
       </w:pPr>
       <w:r>
-        <w:t>[17] Kissel R, Regenscheid A, Scholl M, Stine K. NIST Special Publication 800-88 Revision 1: Guidelines for media sanitization. National Institute of Standards and Technology; 2014. doi:10.6028/NIST.SP.800-88r1.</w:t>
+        <w:t>[17] Guyatt GH, Oxman AD, Kunz R, Woodcock J, Brozek J, Helfand M, et al. GRADE guidelines: 8. Rating the quality of evidence - indirectness. J Clin Epidemiol. 2011;64(12):1303-1310. doi:10.1016/j.jclinepi.2011.04.014.</w:t>
       </w:r>
     </w:p>
     <w:p>
@@ -6680,7 +6680,7 @@
         <w:ind w:left="403" w:hanging="403"/>
       </w:pPr>
       <w:r>
-        <w:t>[18] Boyens J, Smith A, Bartol N, Winkler K, Holbrook A, Fallon M. NIST Special Publication 800-161 Revision 1: Cybersecurity supply chain risk management practices for systems and organizations. National Institute of Standards and Technology; 2022. doi:10.6028/NIST.SP.800-161r1.</w:t>
+        <w:t>[18] Kissel R, Regenscheid A, Scholl M, Stine K. NIST Special Publication 800-88 Revision 1: Guidelines for media sanitization. National Institute of Standards and Technology; 2014. doi:10.6028/NIST.SP.800-88r1.</w:t>
       </w:r>
     </w:p>
     <w:p>
@@ -6689,7 +6689,7 @@
         <w:ind w:left="403" w:hanging="403"/>
       </w:pPr>
       <w:r>
-        <w:t>[19] European Parliament and Council. Regulation (EU) 2023/1542 concerning batteries and waste batteries. Off J Eur Union. 2023;L191:1-117.</w:t>
+        <w:t>[19] Boyens J, Smith A, Bartol N, Winkler K, Holbrook A, Fallon M. NIST Special Publication 800-161 Revision 1: Cybersecurity supply chain risk management practices for systems and organizations. National Institute of Standards and Technology; 2022. doi:10.6028/NIST.SP.800-161r1.</w:t>
       </w:r>
     </w:p>
     <w:p>
@@ -6698,7 +6698,7 @@
         <w:ind w:left="403" w:hanging="403"/>
       </w:pPr>
       <w:r>
-        <w:t>[20] Casagrande M, Losiouk E, Conti M, Payer M, Antonioli D. E-Trojans: ransomware, tracking, DoS, and data leaks on battery-powered embedded systems. arXiv:2411.17184; 2024. doi:10.48550/arXiv.2411.17184.</w:t>
+        <w:t>[20] European Parliament and Council. Regulation (EU) 2023/1542 concerning batteries and waste batteries. Off J Eur Union. 2023;L191:1-117.</w:t>
       </w:r>
     </w:p>
     <w:p>
@@ -6707,7 +6707,7 @@
         <w:ind w:left="403" w:hanging="403"/>
       </w:pPr>
       <w:r>
-        <w:t>[21] Isik AB, Dag T, Ozkan K. E-scooter sharing platforms: understanding their architecture and cybersecurity threats. In: 2023 IEEE 26th International Conference on Intelligent Transportation Systems (ITSC). IEEE; 2023. doi:10.1109/ITSC57777.2023.10421849.</w:t>
+        <w:t>[21] Casagrande M, Losiouk E, Conti M, Payer M, Antonioli D. E-Trojans: ransomware, tracking, DoS, and data leaks on battery-powered embedded systems. arXiv:2411.17184; 2024. doi:10.48550/arXiv.2411.17184.</w:t>
       </w:r>
     </w:p>
     <w:p>
@@ -6716,7 +6716,7 @@
         <w:ind w:left="403" w:hanging="403"/>
       </w:pPr>
       <w:r>
-        <w:t>[22] Vinayaga-Sureshkanth N, Maiti A, Jadliwala M, Crager K, He J, Rathore H. Security and privacy challenges in upcoming intelligent urban micromobility transportation systems. In: Proceedings of the Second ACM Workshop on Automotive and Aerial Vehicle Security (AutoSec). ACM; 2020. doi:10.1145/3375706.3380559.</w:t>
+        <w:t>[22] Isik AB, Dag T, Ozkan K. E-scooter sharing platforms: understanding their architecture and cybersecurity threats. In: 2023 IEEE 26th International Conference on Intelligent Transportation Systems (ITSC). IEEE; 2023. doi:10.1109/ITSC57777.2023.10421849.</w:t>
       </w:r>
     </w:p>
     <w:p>
@@ -6725,7 +6725,7 @@
         <w:ind w:left="403" w:hanging="403"/>
       </w:pPr>
       <w:r>
-        <w:t>[23] Yilmaz S, Karsligil ME. Analysis of location spoofing threats on e-scooter sharing. In: 2022 30th Signal Processing and Communications Applications Conference (SIU). IEEE; 2022. doi:10.1109/SIU55565.2022.9864946.</w:t>
+        <w:t>[23] Vinayaga-Sureshkanth N, Maiti A, Jadliwala M, Crager K, He J, Rathore H. Security and privacy challenges in upcoming intelligent urban micromobility transportation systems. In: Proceedings of the Second ACM Workshop on Automotive and Aerial Vehicle Security (AutoSec). ACM; 2020. doi:10.1145/3375706.3380559.</w:t>
       </w:r>
     </w:p>
     <w:p>
@@ -6734,7 +6734,7 @@
         <w:ind w:left="403" w:hanging="403"/>
       </w:pPr>
       <w:r>
-        <w:t>[24] Sato K, Fukushima N, Fujii K, Kitani T. Data acquisition framework for micromobility vehicles toward driving risk prediction. IEEE Secur Priv. 2025;23(1). doi:10.1109/MSEC.2024.3441731.</w:t>
+        <w:t>[24] Yilmaz S, Karsligil ME. Analysis of location spoofing threats on e-scooter sharing. In: 2022 30th Signal Processing and Communications Applications Conference (SIU). IEEE; 2022. doi:10.1109/SIU55565.2022.9864946.</w:t>
       </w:r>
     </w:p>
     <w:p>
@@ -6743,7 +6743,7 @@
         <w:ind w:left="403" w:hanging="403"/>
       </w:pPr>
       <w:r>
-        <w:t>[25] Li Y, Zhang X. Linking privacy concerns for traceable information and information privacy protective responses. In: Proceedings of the 53rd Hawaii International Conference on System Sciences (HICSS). 2020. doi:10.24251/HICSS.2020.105.</w:t>
+        <w:t>[25] Sato K, Fukushima N, Fujii K, Kitani T. Data acquisition framework for micromobility vehicles toward driving risk prediction. IEEE Secur Priv. 2025;23(1). doi:10.1109/MSEC.2024.3441731.</w:t>
       </w:r>
     </w:p>
     <w:p>
@@ -6752,7 +6752,7 @@
         <w:ind w:left="403" w:hanging="403"/>
       </w:pPr>
       <w:r>
-        <w:t>[26] Petersen ML. Scoot over smart devices: the invisible costs of rental scooters. Surveill Soc. 2019;17(1/2):267-273. doi:10.24908/ss.v17i1/2.13112.</w:t>
+        <w:t>[26] Li Y, Zhang X. Linking privacy concerns for traceable information and information privacy protective responses. In: Proceedings of the 53rd Hawaii International Conference on System Sciences (HICSS). 2020. doi:10.24251/HICSS.2020.105.</w:t>
       </w:r>
     </w:p>
     <w:p>
@@ -6761,7 +6761,7 @@
         <w:ind w:left="403" w:hanging="403"/>
       </w:pPr>
       <w:r>
-        <w:t>[27] Zhou Y. Data extraction in dockless bikeshare: an analysis from users' perspective. Big Data Soc. 2024;11(4). doi:10.1177/20539517241299724.</w:t>
+        <w:t>[27] Petersen ML. Scoot over smart devices: the invisible costs of rental scooters. Surveill Soc. 2019;17(1/2):267-273. doi:10.24908/ss.v17i1/2.13112.</w:t>
       </w:r>
     </w:p>
     <w:p>
@@ -6770,7 +6770,7 @@
         <w:ind w:left="403" w:hanging="403"/>
       </w:pPr>
       <w:r>
-        <w:t>[28] Hannemann A, Buchholz E, Ziegler D. Is homomorphic encryption feasible for smart mobility? In: Annals of Computer Science and Information Systems, vol. 35 (FedCSIS). 2023. doi:10.15439/2023F695.</w:t>
+        <w:t>[28] Zhou Y. Data extraction in dockless bikeshare: an analysis from users' perspective. Big Data Soc. 2024;11(4). doi:10.1177/20539517241299724.</w:t>
       </w:r>
     </w:p>
     <w:p>
@@ -6779,7 +6779,16 @@
         <w:ind w:left="403" w:hanging="403"/>
       </w:pPr>
       <w:r>
-        <w:t>[29] European Parliament and Council. Regulation (EU) 2016/679 (General Data Protection Regulation). Off J Eur Union. 2016;L119:1-88.</w:t>
+        <w:t>[29] Hannemann A, Buchholz E, Ziegler D. Is homomorphic encryption feasible for smart mobility? In: Annals of Computer Science and Information Systems, vol. 35 (FedCSIS). 2023. doi:10.15439/2023F695.</w:t>
+      </w:r>
+    </w:p>
+    <w:p>
+      <w:pPr>
+        <w:spacing w:line="240" w:lineRule="auto" w:after="80"/>
+        <w:ind w:left="403" w:hanging="403"/>
+      </w:pPr>
+      <w:r>
+        <w:t>[30] European Parliament and Council. Regulation (EU) 2016/679 (General Data Protection Regulation). Off J Eur Union. 2016;L119:1-88.</w:t>
       </w:r>
     </w:p>
     <w:sectPr>

</xml_diff>